<commit_message>
Prepare honest Gen5 final-review presentation and offline pack
</commit_message>
<xml_diff>
--- a/university/final_review_2026_10_10/PRESENTER_REFERENCE.docx
+++ b/university/final_review_2026_10_10/PRESENTER_REFERENCE.docx
@@ -1049,7 +1049,7 @@
         <w:pStyle w:val="FirstParagraph"/>
       </w:pPr>
       <w:r>
-        <w:t xml:space="preserve">Walk through four transparent steps: choose the modelled 3U case; show the shot figure and operating-point table; independently integrate its release state for two orbits; then inspect the rated-orbit plot, mass comparison and FreeCAD section. The panel can inspect the scripts, FreeCAD document and reports in this repository. If a script cannot run during review, the slide and handbook reproduce the model chain. Call this a</w:t>
+        <w:t xml:space="preserve">Walk through the revised evidence chain on the slide: the finite-position force curve challenges the historical constant-force shot, then the common-input mission screen compares the assumed finite-force ideal upper speed with springs and the historical model. The accepted twelve-shot prefixes are limited and no case closes. The panel can inspect P118, the matched-mission result JSON, scripts, FreeCAD documents and reports in this repository. If a script cannot run during review, the slide and handbook reproduce the captured outputs. Call this a</w:t>
       </w:r>
       <w:r>
         <w:t xml:space="preserve"> </w:t>
@@ -1062,7 +1062,7 @@
         <w:t xml:space="preserve">computational demonstration</w:t>
       </w:r>
       <w:r>
-        <w:t xml:space="preserve">.</w:t>
+        <w:t xml:space="preserve">, never a motor test.</w:t>
       </w:r>
     </w:p>
     <w:bookmarkEnd w:id="42"/>

</xml_diff>